<commit_message>
Grinzi intoarse: placa la partea de jos a sectiunii
Daca placa din grupul de cofraj e la partea de jos a sectiunii, grinda e
intoarsa: sectiunea la 1:20 se deseneaza cu placa jos (cu rupere) si sus
dreptunghi curat. Datele salvate pe desfasurata poarta al patrulea camp.

Co-Authored-By: Claude Opus 5.5 <noreply@anthropic.com>
Claude-Session: https://claude.ai/code/session_01VzCPnt18Hc4yP6MHc3QNXb
</commit_message>
<xml_diff>
--- a/GenerareGrinziBuiandrugi - documentatie.docx
+++ b/GenerareGrinziBuiandrugi - documentatie.docx
@@ -1001,7 +1001,17 @@
         <w:spacing w:after="60" w:line="276"/>
       </w:pPr>
       <w:r>
-        <w:t xml:space="preserve">Sectiunea poate fi un dreptunghi (fara placa, 4 varfuri) sau in T / L (cu placa).</w:t>
+        <w:t xml:space="preserve">Sectiunea poate fi un dreptunghi (fara placa, 4 varfuri) sau in T / L (cu placa). Daca placa e la partea de jos a sectiunii de cofraj, grinda e </w:t>
+      </w:r>
+      <w:r>
+        <w:rPr>
+          <w:b/>
+          <w:bCs/>
+        </w:rPr>
+        <w:t xml:space="preserve">intoarsa</w:t>
+      </w:r>
+      <w:r>
+        <w:t xml:space="preserve">: in sectiunea la 1:20 placa se pune jos, iar sus ramane dreptunghi curat.</w:t>
       </w:r>
     </w:p>
     <w:p>

</xml_diff>